<commit_message>
refactor(template): adjust indentation of title placeholders in document templates for improved formatting consistency
</commit_message>
<xml_diff>
--- a/template/UNDANGAN SIDANG TEMPLATE.docx
+++ b/template/UNDANGAN SIDANG TEMPLATE.docx
@@ -1,6 +1,6 @@
 
 <file path=word/document.xml><?xml version="1.0" encoding="utf-8"?>
-<w:document xmlns:wpc="http://schemas.microsoft.com/office/word/2010/wordprocessingCanvas" xmlns:cx="http://schemas.microsoft.com/office/drawing/2014/chartex" xmlns:cx1="http://schemas.microsoft.com/office/drawing/2015/9/8/chartex" xmlns:cx2="http://schemas.microsoft.com/office/drawing/2015/10/21/chartex" xmlns:cx3="http://schemas.microsoft.com/office/drawing/2016/5/9/chartex" xmlns:cx4="http://schemas.microsoft.com/office/drawing/2016/5/10/chartex" xmlns:cx5="http://schemas.microsoft.com/office/drawing/2016/5/11/chartex" xmlns:cx6="http://schemas.microsoft.com/office/drawing/2016/5/12/chartex" xmlns:cx7="http://schemas.microsoft.com/office/drawing/2016/5/13/chartex" xmlns:cx8="http://schemas.microsoft.com/office/drawing/2016/5/14/chartex" xmlns:mc="http://schemas.openxmlformats.org/markup-compatibility/2006" xmlns:aink="http://schemas.microsoft.com/office/drawing/2016/ink" xmlns:am3d="http://schemas.microsoft.com/office/drawing/2017/model3d" xmlns:o="urn:schemas-microsoft-com:office:office" xmlns:oel="http://schemas.microsoft.com/office/2019/extlst" xmlns:r="http://schemas.openxmlformats.org/officeDocument/2006/relationships" xmlns:m="http://schemas.openxmlformats.org/officeDocument/2006/math" xmlns:v="urn:schemas-microsoft-com:vml" xmlns:wp14="http://schemas.microsoft.com/office/word/2010/wordprocessingDrawing" xmlns:wp="http://schemas.openxmlformats.org/drawingml/2006/wordprocessingDrawing" xmlns:w10="urn:schemas-microsoft-com:office:word" xmlns:w="http://schemas.openxmlformats.org/wordprocessingml/2006/main" xmlns:w14="http://schemas.microsoft.com/office/word/2010/wordml" xmlns:w15="http://schemas.microsoft.com/office/word/2012/wordml" xmlns:w16cei="http://schemas.microsoft.com/office/word/2026/wordml/cei" xmlns:w16cex="http://schemas.microsoft.com/office/word/2018/wordml/cex" xmlns:w16cid="http://schemas.microsoft.com/office/word/2016/wordml/cid" xmlns:w16="http://schemas.microsoft.com/office/word/2018/wordml" xmlns:w16du="http://schemas.microsoft.com/office/word/2023/wordml/word16du" xmlns:w16sdtdh="http://schemas.microsoft.com/office/word/2020/wordml/sdtdatahash" xmlns:w16sdtfl="http://schemas.microsoft.com/office/word/2024/wordml/sdtformatlock" xmlns:w16se="http://schemas.microsoft.com/office/word/2015/wordml/symex" xmlns:wpg="http://schemas.microsoft.com/office/word/2010/wordprocessingGroup" xmlns:wpi="http://schemas.microsoft.com/office/word/2010/wordprocessingInk" xmlns:wne="http://schemas.microsoft.com/office/word/2006/wordml" xmlns:wps="http://schemas.microsoft.com/office/word/2010/wordprocessingShape" mc:Ignorable="w14 w15 w16se w16cid w16 w16cex w16sdtdh w16sdtfl w16du wp14">
+<w:document xmlns:wpc="http://schemas.microsoft.com/office/word/2010/wordprocessingCanvas" xmlns:cx="http://schemas.microsoft.com/office/drawing/2014/chartex" xmlns:cx1="http://schemas.microsoft.com/office/drawing/2015/9/8/chartex" xmlns:cx2="http://schemas.microsoft.com/office/drawing/2015/10/21/chartex" xmlns:cx3="http://schemas.microsoft.com/office/drawing/2016/5/9/chartex" xmlns:cx4="http://schemas.microsoft.com/office/drawing/2016/5/10/chartex" xmlns:cx5="http://schemas.microsoft.com/office/drawing/2016/5/11/chartex" xmlns:cx6="http://schemas.microsoft.com/office/drawing/2016/5/12/chartex" xmlns:cx7="http://schemas.microsoft.com/office/drawing/2016/5/13/chartex" xmlns:cx8="http://schemas.microsoft.com/office/drawing/2016/5/14/chartex" xmlns:mc="http://schemas.openxmlformats.org/markup-compatibility/2006" xmlns:aink="http://schemas.microsoft.com/office/drawing/2016/ink" xmlns:am3d="http://schemas.microsoft.com/office/drawing/2017/model3d" xmlns:o="urn:schemas-microsoft-com:office:office" xmlns:oel="http://schemas.microsoft.com/office/2019/extlst" xmlns:r="http://schemas.openxmlformats.org/officeDocument/2006/relationships" xmlns:m="http://schemas.openxmlformats.org/officeDocument/2006/math" xmlns:v="urn:schemas-microsoft-com:vml" xmlns:wp14="http://schemas.microsoft.com/office/word/2010/wordprocessingDrawing" xmlns:wp="http://schemas.openxmlformats.org/drawingml/2006/wordprocessingDrawing" xmlns:w10="urn:schemas-microsoft-com:office:word" xmlns:w="http://schemas.openxmlformats.org/wordprocessingml/2006/main" xmlns:w14="http://schemas.microsoft.com/office/word/2010/wordml" xmlns:w15="http://schemas.microsoft.com/office/word/2012/wordml" xmlns:w16cex="http://schemas.microsoft.com/office/word/2018/wordml/cex" xmlns:w16cid="http://schemas.microsoft.com/office/word/2016/wordml/cid" xmlns:w16="http://schemas.microsoft.com/office/word/2018/wordml" xmlns:w16du="http://schemas.microsoft.com/office/word/2023/wordml/word16du" xmlns:w16sdtdh="http://schemas.microsoft.com/office/word/2020/wordml/sdtdatahash" xmlns:w16sdtfl="http://schemas.microsoft.com/office/word/2024/wordml/sdtformatlock" xmlns:w16se="http://schemas.microsoft.com/office/word/2015/wordml/symex" xmlns:wpg="http://schemas.microsoft.com/office/word/2010/wordprocessingGroup" xmlns:wpi="http://schemas.microsoft.com/office/word/2010/wordprocessingInk" xmlns:wne="http://schemas.microsoft.com/office/word/2006/wordml" xmlns:wps="http://schemas.microsoft.com/office/word/2010/wordprocessingShape" mc:Ignorable="w14 w15 w16se w16cid w16 w16cex w16sdtdh w16sdtfl w16du wp14">
   <w:body>
     <w:p>
       <w:pPr>
@@ -256,7 +256,7 @@
           </mc:Choice>
           <mc:Fallback>
             <w:pict>
-              <v:group w14:anchorId="627A14D3" id="Group 1" o:spid="_x0000_s1026" style="position:absolute;margin-left:8.8pt;margin-top:6.8pt;width:554.5pt;height:406.3pt;z-index:-15793664;mso-wrap-distance-left:0;mso-wrap-distance-right:0;mso-position-horizontal-relative:page;mso-position-vertical-relative:page" coordsize="70421,51600" o:gfxdata="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">
+              <v:group w14:anchorId="03CD657E" id="Group 1" o:spid="_x0000_s1026" style="position:absolute;margin-left:8.8pt;margin-top:6.8pt;width:554.5pt;height:406.3pt;z-index:-15793664;mso-wrap-distance-left:0;mso-wrap-distance-right:0;mso-position-horizontal-relative:page;mso-position-vertical-relative:page" coordsize="70421,51600" o:gfxdata="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">
                 <v:shapetype id="_x0000_t75" coordsize="21600,21600" o:spt="75" o:preferrelative="t" path="m@4@5l@4@11@9@11@9@5xe" filled="f" stroked="f">
                   <v:stroke joinstyle="miter"/>
                   <v:formulas>
@@ -768,22 +768,13 @@
         <w:t xml:space="preserve"> </w:t>
       </w:r>
       <w:r>
-        <w:t>(NIM</w:t>
-      </w:r>
-      <w:r>
-        <w:t xml:space="preserve"> </w:t>
+        <w:t xml:space="preserve">(NIM </w:t>
       </w:r>
       <w:r>
         <w:rPr>
           <w:spacing w:val="-2"/>
         </w:rPr>
-        <w:t>${nim}</w:t>
-      </w:r>
-      <w:r>
-        <w:rPr>
-          <w:spacing w:val="-2"/>
-        </w:rPr>
-        <w:t>)</w:t>
+        <w:t>${nim})</w:t>
       </w:r>
     </w:p>
     <w:p>
@@ -810,6 +801,7 @@
         <w:ind w:left="671" w:right="1055"/>
         <w:jc w:val="center"/>
         <w:rPr>
+          <w:spacing w:val="-10"/>
           <w:sz w:val="20"/>
         </w:rPr>
       </w:pPr>
@@ -849,8 +841,12 @@
     </w:p>
     <w:p>
       <w:pPr>
-        <w:pStyle w:val="Heading1"/>
-        <w:ind w:left="671"/>
+        <w:spacing w:before="94"/>
+        <w:ind w:left="671" w:right="1055"/>
+        <w:jc w:val="center"/>
+        <w:rPr>
+          <w:sz w:val="20"/>
+        </w:rPr>
       </w:pPr>
       <w:r>
         <w:t>${judul}</w:t>

</xml_diff>